<commit_message>
Final changes to the project file
</commit_message>
<xml_diff>
--- a/report/Project-Report.docx
+++ b/report/Project-Report.docx
@@ -1123,13 +1123,19 @@
         <w:rPr>
           <w:spacing w:val="30"/>
         </w:rPr>
-        <w:t>F</w:t>
+        <w:t xml:space="preserve">For Task 2, I created and updated my profiles on GitHub, LinkedIn, and </w:t>
       </w:r>
       <w:r>
         <w:rPr>
           <w:spacing w:val="30"/>
         </w:rPr>
-        <w:t>or Task 2, I created and updated my profiles on GitHub, LinkedIn, and Kaggle to build a professional digital presence. On GitHub, I set up my profile README, which includes my name, branch, year, and a brief description of my learning goals. This platform will help me showcase my coding projects and track my progress over time.</w:t>
+        <w:t>Stack Overflow</w:t>
+      </w:r>
+      <w:r>
+        <w:rPr>
+          <w:spacing w:val="30"/>
+        </w:rPr>
+        <w:t xml:space="preserve"> to build a professional digital presence. On GitHub, I set up my profile README, which includes my name, branch, year, and a brief description of my learning goals. This platform will help me showcase my coding projects and track my progress over time.</w:t>
       </w:r>
     </w:p>
     <w:p>
@@ -1143,7 +1149,39 @@
         <w:rPr>
           <w:spacing w:val="30"/>
         </w:rPr>
-        <w:t>On LinkedIn, I completed my education details, including my degree, institution, and expected graduation year. LinkedIn will help me connect with professionals, explore career opportunities, and build a professional network. On Kaggle, I created an account to explore datasets and improve my skills in data analysis and machine learning.</w:t>
+        <w:t xml:space="preserve">On LinkedIn, I completed my education details, including my degree, institution, and expected graduation year. LinkedIn will help me connect with professionals, explore career opportunities, and build a professional network. On </w:t>
+      </w:r>
+      <w:r>
+        <w:rPr>
+          <w:spacing w:val="30"/>
+        </w:rPr>
+        <w:t>Stack Overflow</w:t>
+      </w:r>
+      <w:r>
+        <w:rPr>
+          <w:spacing w:val="30"/>
+        </w:rPr>
+        <w:t xml:space="preserve">, I created an account to explore </w:t>
+      </w:r>
+      <w:r>
+        <w:rPr>
+          <w:spacing w:val="30"/>
+        </w:rPr>
+        <w:t xml:space="preserve">the </w:t>
+      </w:r>
+      <w:proofErr w:type="gramStart"/>
+      <w:r>
+        <w:rPr>
+          <w:spacing w:val="30"/>
+        </w:rPr>
+        <w:t>community ,</w:t>
+      </w:r>
+      <w:proofErr w:type="gramEnd"/>
+      <w:r>
+        <w:rPr>
+          <w:spacing w:val="30"/>
+        </w:rPr>
+        <w:t xml:space="preserve"> clear my doubts and to interact with fellow coders .</w:t>
       </w:r>
     </w:p>
     <w:p>
@@ -1233,21 +1271,7 @@
         <w:rPr>
           <w:spacing w:val="30"/>
         </w:rPr>
-        <w:t xml:space="preserve">For Task 3, I explored both coding practice platforms and collaboration tools. I created an account on </w:t>
-      </w:r>
-      <w:proofErr w:type="spellStart"/>
-      <w:r>
-        <w:rPr>
-          <w:spacing w:val="30"/>
-        </w:rPr>
-        <w:t>HackerRank</w:t>
-      </w:r>
-      <w:proofErr w:type="spellEnd"/>
-      <w:r>
-        <w:rPr>
-          <w:spacing w:val="30"/>
-        </w:rPr>
-        <w:t xml:space="preserve"> and completed a beginner-level problem, which helped me understand basic problem-solving and coding logic. This platform is useful for improving programming skills and preparing for technical interviews.</w:t>
+        <w:t>For Task 3, I explored both coding practice platforms and collaboration tools. I created an account on HackerRank and completed a beginner-level problem, which helped me understand basic problem-solving and coding logic. This platform is useful for improving programming skills and preparing for technical interviews.</w:t>
       </w:r>
     </w:p>
     <w:p>
@@ -1289,21 +1313,7 @@
         <w:rPr>
           <w:spacing w:val="30"/>
         </w:rPr>
-        <w:t xml:space="preserve">These tools are very useful for students as they support both learning and collaboration. </w:t>
-      </w:r>
-      <w:proofErr w:type="spellStart"/>
-      <w:r>
-        <w:rPr>
-          <w:spacing w:val="30"/>
-        </w:rPr>
-        <w:t>HackerRank</w:t>
-      </w:r>
-      <w:proofErr w:type="spellEnd"/>
-      <w:r>
-        <w:rPr>
-          <w:spacing w:val="30"/>
-        </w:rPr>
-        <w:t xml:space="preserve"> helps in building coding skills, while Google Forms and Sheets are useful for surveys, quizzes, and teamwork. This task gave me hands-on experience with practical tools that I can use throughout my academic journey. It also improved my understanding of how technology can be used for both individual learning and group activities.</w:t>
+        <w:t>These tools are very useful for students as they support both learning and collaboration. HackerRank helps in building coding skills, while Google Forms and Sheets are useful for surveys, quizzes, and teamwork. This task gave me hands-on experience with practical tools that I can use throughout my academic journey. It also improved my understanding of how technology can be used for both individual learning and group activities.</w:t>
       </w:r>
     </w:p>
     <w:p>
@@ -1500,6 +1510,556 @@
         </w:rPr>
         <w:t>I also created a prevention checklist that included practical tips to stay safe online, especially for students. One important habit I will change is being more cautious while sharing personal or financial information online. I will also make sure to verify sources before trusting any message or link. This task increased my awareness of online risks and taught me how to protect myself and others in the digital world.</w:t>
       </w:r>
+    </w:p>
+    <w:p>
+      <w:pPr>
+        <w:pStyle w:val="NormalWeb"/>
+        <w:rPr>
+          <w:spacing w:val="30"/>
+        </w:rPr>
+      </w:pPr>
+    </w:p>
+    <w:p>
+      <w:pPr>
+        <w:pStyle w:val="NormalWeb"/>
+        <w:rPr>
+          <w:spacing w:val="30"/>
+        </w:rPr>
+      </w:pPr>
+    </w:p>
+    <w:p>
+      <w:pPr>
+        <w:pStyle w:val="NormalWeb"/>
+        <w:rPr>
+          <w:spacing w:val="30"/>
+        </w:rPr>
+      </w:pPr>
+    </w:p>
+    <w:p>
+      <w:pPr>
+        <w:pStyle w:val="NormalWeb"/>
+        <w:rPr>
+          <w:spacing w:val="30"/>
+        </w:rPr>
+      </w:pPr>
+    </w:p>
+    <w:p>
+      <w:pPr>
+        <w:jc w:val="center"/>
+        <w:rPr>
+          <w:rFonts w:ascii="Times New Roman" w:eastAsia="MS UI Gothic" w:hAnsi="Times New Roman" w:cs="Times New Roman"/>
+          <w:b/>
+          <w:bCs/>
+          <w:color w:val="FF0000"/>
+          <w:sz w:val="48"/>
+          <w:szCs w:val="48"/>
+          <w:u w:val="single"/>
+        </w:rPr>
+      </w:pPr>
+    </w:p>
+    <w:p>
+      <w:pPr>
+        <w:jc w:val="center"/>
+        <w:rPr>
+          <w:rFonts w:ascii="Times New Roman" w:eastAsia="MS UI Gothic" w:hAnsi="Times New Roman" w:cs="Times New Roman"/>
+          <w:b/>
+          <w:bCs/>
+          <w:color w:val="FF0000"/>
+          <w:sz w:val="48"/>
+          <w:szCs w:val="48"/>
+          <w:u w:val="single"/>
+        </w:rPr>
+      </w:pPr>
+      <w:r>
+        <w:rPr>
+          <w:rFonts w:ascii="Times New Roman" w:eastAsia="MS UI Gothic" w:hAnsi="Times New Roman" w:cs="Times New Roman"/>
+          <w:b/>
+          <w:bCs/>
+          <w:color w:val="FF0000"/>
+          <w:sz w:val="48"/>
+          <w:szCs w:val="48"/>
+          <w:u w:val="single"/>
+        </w:rPr>
+        <w:lastRenderedPageBreak/>
+        <w:t>Conclusion</w:t>
+      </w:r>
+    </w:p>
+    <w:p>
+      <w:pPr>
+        <w:rPr>
+          <w:rFonts w:ascii="Times New Roman" w:hAnsi="Times New Roman" w:cs="Times New Roman"/>
+          <w:spacing w:val="30"/>
+        </w:rPr>
+      </w:pPr>
+      <w:r>
+        <w:rPr>
+          <w:rFonts w:ascii="Times New Roman" w:hAnsi="Times New Roman" w:cs="Times New Roman"/>
+          <w:spacing w:val="30"/>
+        </w:rPr>
+        <w:t>This project helped me develop a strong understanding of digital literacy and its importance in today’s world. Through the different tasks, I learned how to use digital tools effectively, build a professional online presence, and communicate responsibly. I also gained awareness about online safety and cybercrime prevention. Each activity gave me practical experience and improved my confidence in using technology for academic and personal purposes. Overall, this project has helped me become a more responsible and informed digital user, and it will be useful for my future studies and career.</w:t>
+      </w:r>
+    </w:p>
+    <w:p>
+      <w:pPr>
+        <w:ind w:left="2880"/>
+        <w:rPr>
+          <w:rFonts w:ascii="Times New Roman" w:eastAsia="MS UI Gothic" w:hAnsi="Times New Roman" w:cs="Times New Roman"/>
+          <w:b/>
+          <w:bCs/>
+          <w:color w:val="FF0000"/>
+          <w:sz w:val="48"/>
+          <w:szCs w:val="48"/>
+          <w:u w:val="single"/>
+        </w:rPr>
+      </w:pPr>
+      <w:r>
+        <w:rPr>
+          <w:rFonts w:ascii="Times New Roman" w:eastAsia="MS UI Gothic" w:hAnsi="Times New Roman" w:cs="Times New Roman"/>
+          <w:b/>
+          <w:bCs/>
+          <w:color w:val="FF0000"/>
+          <w:sz w:val="48"/>
+          <w:szCs w:val="48"/>
+          <w:u w:val="single"/>
+        </w:rPr>
+        <w:t xml:space="preserve">References </w:t>
+      </w:r>
+    </w:p>
+    <w:p>
+      <w:pPr>
+        <w:spacing w:after="0" w:line="240" w:lineRule="auto"/>
+        <w:rPr>
+          <w:rFonts w:ascii="Times New Roman" w:eastAsia="Times New Roman" w:hAnsi="Times New Roman" w:cs="Times New Roman"/>
+          <w:sz w:val="24"/>
+          <w:szCs w:val="24"/>
+          <w:lang w:val="en-IN" w:eastAsia="en-IN"/>
+        </w:rPr>
+      </w:pPr>
+      <w:proofErr w:type="gramStart"/>
+      <w:r>
+        <w:rPr>
+          <w:rFonts w:ascii="Times New Roman" w:eastAsia="Times New Roman" w:hAnsi="Symbol" w:cs="Times New Roman"/>
+          <w:sz w:val="24"/>
+          <w:szCs w:val="24"/>
+          <w:lang w:val="en-IN" w:eastAsia="en-IN"/>
+        </w:rPr>
+        <w:t></w:t>
+      </w:r>
+      <w:r>
+        <w:rPr>
+          <w:rFonts w:ascii="Times New Roman" w:eastAsia="Times New Roman" w:hAnsi="Times New Roman" w:cs="Times New Roman"/>
+          <w:sz w:val="24"/>
+          <w:szCs w:val="24"/>
+          <w:lang w:val="en-IN" w:eastAsia="en-IN"/>
+        </w:rPr>
+        <w:t xml:space="preserve">  Canva</w:t>
+      </w:r>
+      <w:proofErr w:type="gramEnd"/>
+      <w:r>
+        <w:rPr>
+          <w:rFonts w:ascii="Times New Roman" w:eastAsia="Times New Roman" w:hAnsi="Times New Roman" w:cs="Times New Roman"/>
+          <w:sz w:val="24"/>
+          <w:szCs w:val="24"/>
+          <w:lang w:val="en-IN" w:eastAsia="en-IN"/>
+        </w:rPr>
+        <w:t xml:space="preserve"> – </w:t>
+      </w:r>
+      <w:hyperlink r:id="rId7" w:tgtFrame="_new" w:history="1">
+        <w:r>
+          <w:rPr>
+            <w:rFonts w:ascii="Times New Roman" w:eastAsia="Times New Roman" w:hAnsi="Times New Roman" w:cs="Times New Roman"/>
+            <w:color w:val="0000FF"/>
+            <w:sz w:val="24"/>
+            <w:szCs w:val="24"/>
+            <w:u w:val="single"/>
+            <w:lang w:val="en-IN" w:eastAsia="en-IN"/>
+          </w:rPr>
+          <w:t>https://www.canva.com</w:t>
+        </w:r>
+      </w:hyperlink>
+      <w:r>
+        <w:rPr>
+          <w:rFonts w:ascii="Times New Roman" w:eastAsia="Times New Roman" w:hAnsi="Times New Roman" w:cs="Times New Roman"/>
+          <w:sz w:val="24"/>
+          <w:szCs w:val="24"/>
+          <w:lang w:val="en-IN" w:eastAsia="en-IN"/>
+        </w:rPr>
+        <w:t xml:space="preserve"> </w:t>
+      </w:r>
+    </w:p>
+    <w:p>
+      <w:pPr>
+        <w:spacing w:after="0" w:line="240" w:lineRule="auto"/>
+        <w:rPr>
+          <w:rFonts w:ascii="Times New Roman" w:eastAsia="Times New Roman" w:hAnsi="Times New Roman" w:cs="Times New Roman"/>
+          <w:sz w:val="24"/>
+          <w:szCs w:val="24"/>
+          <w:lang w:val="en-IN" w:eastAsia="en-IN"/>
+        </w:rPr>
+      </w:pPr>
+      <w:proofErr w:type="gramStart"/>
+      <w:r>
+        <w:rPr>
+          <w:rFonts w:ascii="Times New Roman" w:eastAsia="Times New Roman" w:hAnsi="Symbol" w:cs="Times New Roman"/>
+          <w:sz w:val="24"/>
+          <w:szCs w:val="24"/>
+          <w:lang w:val="en-IN" w:eastAsia="en-IN"/>
+        </w:rPr>
+        <w:t></w:t>
+      </w:r>
+      <w:r>
+        <w:rPr>
+          <w:rFonts w:ascii="Times New Roman" w:eastAsia="Times New Roman" w:hAnsi="Times New Roman" w:cs="Times New Roman"/>
+          <w:sz w:val="24"/>
+          <w:szCs w:val="24"/>
+          <w:lang w:val="en-IN" w:eastAsia="en-IN"/>
+        </w:rPr>
+        <w:t xml:space="preserve">  GitHub</w:t>
+      </w:r>
+      <w:proofErr w:type="gramEnd"/>
+      <w:r>
+        <w:rPr>
+          <w:rFonts w:ascii="Times New Roman" w:eastAsia="Times New Roman" w:hAnsi="Times New Roman" w:cs="Times New Roman"/>
+          <w:sz w:val="24"/>
+          <w:szCs w:val="24"/>
+          <w:lang w:val="en-IN" w:eastAsia="en-IN"/>
+        </w:rPr>
+        <w:t xml:space="preserve"> – </w:t>
+      </w:r>
+      <w:hyperlink r:id="rId8" w:tgtFrame="_new" w:history="1">
+        <w:r>
+          <w:rPr>
+            <w:rFonts w:ascii="Times New Roman" w:eastAsia="Times New Roman" w:hAnsi="Times New Roman" w:cs="Times New Roman"/>
+            <w:color w:val="0000FF"/>
+            <w:sz w:val="24"/>
+            <w:szCs w:val="24"/>
+            <w:u w:val="single"/>
+            <w:lang w:val="en-IN" w:eastAsia="en-IN"/>
+          </w:rPr>
+          <w:t>https://github.com</w:t>
+        </w:r>
+      </w:hyperlink>
+      <w:r>
+        <w:rPr>
+          <w:rFonts w:ascii="Times New Roman" w:eastAsia="Times New Roman" w:hAnsi="Times New Roman" w:cs="Times New Roman"/>
+          <w:sz w:val="24"/>
+          <w:szCs w:val="24"/>
+          <w:lang w:val="en-IN" w:eastAsia="en-IN"/>
+        </w:rPr>
+        <w:t xml:space="preserve"> </w:t>
+      </w:r>
+    </w:p>
+    <w:p>
+      <w:pPr>
+        <w:spacing w:after="0" w:line="240" w:lineRule="auto"/>
+        <w:rPr>
+          <w:rFonts w:ascii="Times New Roman" w:eastAsia="Times New Roman" w:hAnsi="Times New Roman" w:cs="Times New Roman"/>
+          <w:sz w:val="24"/>
+          <w:szCs w:val="24"/>
+          <w:lang w:val="en-IN" w:eastAsia="en-IN"/>
+        </w:rPr>
+      </w:pPr>
+      <w:proofErr w:type="gramStart"/>
+      <w:r>
+        <w:rPr>
+          <w:rFonts w:ascii="Times New Roman" w:eastAsia="Times New Roman" w:hAnsi="Symbol" w:cs="Times New Roman"/>
+          <w:sz w:val="24"/>
+          <w:szCs w:val="24"/>
+          <w:lang w:val="en-IN" w:eastAsia="en-IN"/>
+        </w:rPr>
+        <w:t></w:t>
+      </w:r>
+      <w:r>
+        <w:rPr>
+          <w:rFonts w:ascii="Times New Roman" w:eastAsia="Times New Roman" w:hAnsi="Times New Roman" w:cs="Times New Roman"/>
+          <w:sz w:val="24"/>
+          <w:szCs w:val="24"/>
+          <w:lang w:val="en-IN" w:eastAsia="en-IN"/>
+        </w:rPr>
+        <w:t xml:space="preserve">  LinkedIn</w:t>
+      </w:r>
+      <w:proofErr w:type="gramEnd"/>
+      <w:r>
+        <w:rPr>
+          <w:rFonts w:ascii="Times New Roman" w:eastAsia="Times New Roman" w:hAnsi="Times New Roman" w:cs="Times New Roman"/>
+          <w:sz w:val="24"/>
+          <w:szCs w:val="24"/>
+          <w:lang w:val="en-IN" w:eastAsia="en-IN"/>
+        </w:rPr>
+        <w:t xml:space="preserve"> – </w:t>
+      </w:r>
+      <w:hyperlink r:id="rId9" w:tgtFrame="_new" w:history="1">
+        <w:r>
+          <w:rPr>
+            <w:rFonts w:ascii="Times New Roman" w:eastAsia="Times New Roman" w:hAnsi="Times New Roman" w:cs="Times New Roman"/>
+            <w:color w:val="0000FF"/>
+            <w:sz w:val="24"/>
+            <w:szCs w:val="24"/>
+            <w:u w:val="single"/>
+            <w:lang w:val="en-IN" w:eastAsia="en-IN"/>
+          </w:rPr>
+          <w:t>https://www.linkedin.com</w:t>
+        </w:r>
+      </w:hyperlink>
+      <w:r>
+        <w:rPr>
+          <w:rFonts w:ascii="Times New Roman" w:eastAsia="Times New Roman" w:hAnsi="Times New Roman" w:cs="Times New Roman"/>
+          <w:sz w:val="24"/>
+          <w:szCs w:val="24"/>
+          <w:lang w:val="en-IN" w:eastAsia="en-IN"/>
+        </w:rPr>
+        <w:t xml:space="preserve"> </w:t>
+      </w:r>
+    </w:p>
+    <w:p>
+      <w:pPr>
+        <w:spacing w:after="0" w:line="240" w:lineRule="auto"/>
+        <w:rPr>
+          <w:rFonts w:ascii="Times New Roman" w:eastAsia="Times New Roman" w:hAnsi="Times New Roman" w:cs="Times New Roman"/>
+          <w:sz w:val="24"/>
+          <w:szCs w:val="24"/>
+          <w:lang w:val="en-IN" w:eastAsia="en-IN"/>
+        </w:rPr>
+      </w:pPr>
+      <w:proofErr w:type="gramStart"/>
+      <w:r>
+        <w:rPr>
+          <w:rFonts w:ascii="Times New Roman" w:eastAsia="Times New Roman" w:hAnsi="Symbol" w:cs="Times New Roman"/>
+          <w:sz w:val="24"/>
+          <w:szCs w:val="24"/>
+          <w:lang w:val="en-IN" w:eastAsia="en-IN"/>
+        </w:rPr>
+        <w:t></w:t>
+      </w:r>
+      <w:r>
+        <w:rPr>
+          <w:rFonts w:ascii="Times New Roman" w:eastAsia="Times New Roman" w:hAnsi="Times New Roman" w:cs="Times New Roman"/>
+          <w:sz w:val="24"/>
+          <w:szCs w:val="24"/>
+          <w:lang w:val="en-IN" w:eastAsia="en-IN"/>
+        </w:rPr>
+        <w:t xml:space="preserve">  Kaggle</w:t>
+      </w:r>
+      <w:proofErr w:type="gramEnd"/>
+      <w:r>
+        <w:rPr>
+          <w:rFonts w:ascii="Times New Roman" w:eastAsia="Times New Roman" w:hAnsi="Times New Roman" w:cs="Times New Roman"/>
+          <w:sz w:val="24"/>
+          <w:szCs w:val="24"/>
+          <w:lang w:val="en-IN" w:eastAsia="en-IN"/>
+        </w:rPr>
+        <w:t xml:space="preserve"> – </w:t>
+      </w:r>
+      <w:hyperlink r:id="rId10" w:tgtFrame="_new" w:history="1">
+        <w:r>
+          <w:rPr>
+            <w:rFonts w:ascii="Times New Roman" w:eastAsia="Times New Roman" w:hAnsi="Times New Roman" w:cs="Times New Roman"/>
+            <w:color w:val="0000FF"/>
+            <w:sz w:val="24"/>
+            <w:szCs w:val="24"/>
+            <w:u w:val="single"/>
+            <w:lang w:val="en-IN" w:eastAsia="en-IN"/>
+          </w:rPr>
+          <w:t>https://www.kaggle.com</w:t>
+        </w:r>
+      </w:hyperlink>
+      <w:r>
+        <w:rPr>
+          <w:rFonts w:ascii="Times New Roman" w:eastAsia="Times New Roman" w:hAnsi="Times New Roman" w:cs="Times New Roman"/>
+          <w:sz w:val="24"/>
+          <w:szCs w:val="24"/>
+          <w:lang w:val="en-IN" w:eastAsia="en-IN"/>
+        </w:rPr>
+        <w:t xml:space="preserve"> </w:t>
+      </w:r>
+    </w:p>
+    <w:p>
+      <w:pPr>
+        <w:spacing w:after="0" w:line="240" w:lineRule="auto"/>
+        <w:rPr>
+          <w:rFonts w:ascii="Times New Roman" w:eastAsia="Times New Roman" w:hAnsi="Times New Roman" w:cs="Times New Roman"/>
+          <w:sz w:val="24"/>
+          <w:szCs w:val="24"/>
+          <w:lang w:val="en-IN" w:eastAsia="en-IN"/>
+        </w:rPr>
+      </w:pPr>
+      <w:proofErr w:type="gramStart"/>
+      <w:r>
+        <w:rPr>
+          <w:rFonts w:ascii="Times New Roman" w:eastAsia="Times New Roman" w:hAnsi="Symbol" w:cs="Times New Roman"/>
+          <w:sz w:val="24"/>
+          <w:szCs w:val="24"/>
+          <w:lang w:val="en-IN" w:eastAsia="en-IN"/>
+        </w:rPr>
+        <w:t></w:t>
+      </w:r>
+      <w:r>
+        <w:rPr>
+          <w:rFonts w:ascii="Times New Roman" w:eastAsia="Times New Roman" w:hAnsi="Times New Roman" w:cs="Times New Roman"/>
+          <w:sz w:val="24"/>
+          <w:szCs w:val="24"/>
+          <w:lang w:val="en-IN" w:eastAsia="en-IN"/>
+        </w:rPr>
+        <w:t xml:space="preserve">  </w:t>
+      </w:r>
+      <w:r>
+        <w:rPr>
+          <w:rFonts w:ascii="Times New Roman" w:eastAsia="Times New Roman" w:hAnsi="Times New Roman" w:cs="Times New Roman"/>
+          <w:sz w:val="24"/>
+          <w:szCs w:val="24"/>
+          <w:lang w:val="en-IN" w:eastAsia="en-IN"/>
+        </w:rPr>
+        <w:t>HackerRank</w:t>
+      </w:r>
+      <w:proofErr w:type="gramEnd"/>
+      <w:r>
+        <w:rPr>
+          <w:rFonts w:ascii="Times New Roman" w:eastAsia="Times New Roman" w:hAnsi="Times New Roman" w:cs="Times New Roman"/>
+          <w:sz w:val="24"/>
+          <w:szCs w:val="24"/>
+          <w:lang w:val="en-IN" w:eastAsia="en-IN"/>
+        </w:rPr>
+        <w:t xml:space="preserve"> – </w:t>
+      </w:r>
+      <w:hyperlink r:id="rId11" w:tgtFrame="_new" w:history="1">
+        <w:r>
+          <w:rPr>
+            <w:rFonts w:ascii="Times New Roman" w:eastAsia="Times New Roman" w:hAnsi="Times New Roman" w:cs="Times New Roman"/>
+            <w:color w:val="0000FF"/>
+            <w:sz w:val="24"/>
+            <w:szCs w:val="24"/>
+            <w:u w:val="single"/>
+            <w:lang w:val="en-IN" w:eastAsia="en-IN"/>
+          </w:rPr>
+          <w:t>https://www.hackerrank.com</w:t>
+        </w:r>
+      </w:hyperlink>
+      <w:r>
+        <w:rPr>
+          <w:rFonts w:ascii="Times New Roman" w:eastAsia="Times New Roman" w:hAnsi="Times New Roman" w:cs="Times New Roman"/>
+          <w:sz w:val="24"/>
+          <w:szCs w:val="24"/>
+          <w:lang w:val="en-IN" w:eastAsia="en-IN"/>
+        </w:rPr>
+        <w:t xml:space="preserve"> </w:t>
+      </w:r>
+    </w:p>
+    <w:p>
+      <w:pPr>
+        <w:spacing w:after="0" w:line="240" w:lineRule="auto"/>
+        <w:rPr>
+          <w:rFonts w:ascii="Times New Roman" w:eastAsia="Times New Roman" w:hAnsi="Times New Roman" w:cs="Times New Roman"/>
+          <w:sz w:val="24"/>
+          <w:szCs w:val="24"/>
+          <w:lang w:val="en-IN" w:eastAsia="en-IN"/>
+        </w:rPr>
+      </w:pPr>
+      <w:proofErr w:type="gramStart"/>
+      <w:r>
+        <w:rPr>
+          <w:rFonts w:ascii="Times New Roman" w:eastAsia="Times New Roman" w:hAnsi="Symbol" w:cs="Times New Roman"/>
+          <w:sz w:val="24"/>
+          <w:szCs w:val="24"/>
+          <w:lang w:val="en-IN" w:eastAsia="en-IN"/>
+        </w:rPr>
+        <w:t></w:t>
+      </w:r>
+      <w:r>
+        <w:rPr>
+          <w:rFonts w:ascii="Times New Roman" w:eastAsia="Times New Roman" w:hAnsi="Times New Roman" w:cs="Times New Roman"/>
+          <w:sz w:val="24"/>
+          <w:szCs w:val="24"/>
+          <w:lang w:val="en-IN" w:eastAsia="en-IN"/>
+        </w:rPr>
+        <w:t xml:space="preserve">  Google</w:t>
+      </w:r>
+      <w:proofErr w:type="gramEnd"/>
+      <w:r>
+        <w:rPr>
+          <w:rFonts w:ascii="Times New Roman" w:eastAsia="Times New Roman" w:hAnsi="Times New Roman" w:cs="Times New Roman"/>
+          <w:sz w:val="24"/>
+          <w:szCs w:val="24"/>
+          <w:lang w:val="en-IN" w:eastAsia="en-IN"/>
+        </w:rPr>
+        <w:t xml:space="preserve"> Forms – </w:t>
+      </w:r>
+      <w:hyperlink r:id="rId12" w:tgtFrame="_new" w:history="1">
+        <w:r>
+          <w:rPr>
+            <w:rFonts w:ascii="Times New Roman" w:eastAsia="Times New Roman" w:hAnsi="Times New Roman" w:cs="Times New Roman"/>
+            <w:color w:val="0000FF"/>
+            <w:sz w:val="24"/>
+            <w:szCs w:val="24"/>
+            <w:u w:val="single"/>
+            <w:lang w:val="en-IN" w:eastAsia="en-IN"/>
+          </w:rPr>
+          <w:t>https://forms.google.com</w:t>
+        </w:r>
+      </w:hyperlink>
+      <w:r>
+        <w:rPr>
+          <w:rFonts w:ascii="Times New Roman" w:eastAsia="Times New Roman" w:hAnsi="Times New Roman" w:cs="Times New Roman"/>
+          <w:sz w:val="24"/>
+          <w:szCs w:val="24"/>
+          <w:lang w:val="en-IN" w:eastAsia="en-IN"/>
+        </w:rPr>
+        <w:t xml:space="preserve"> </w:t>
+      </w:r>
+    </w:p>
+    <w:p>
+      <w:pPr>
+        <w:rPr>
+          <w:rFonts w:ascii="Times New Roman" w:eastAsia="MS UI Gothic" w:hAnsi="Times New Roman" w:cs="Times New Roman"/>
+          <w:b/>
+          <w:bCs/>
+          <w:color w:val="FF0000"/>
+          <w:sz w:val="48"/>
+          <w:szCs w:val="48"/>
+          <w:u w:val="single"/>
+        </w:rPr>
+      </w:pPr>
+      <w:proofErr w:type="gramStart"/>
+      <w:r>
+        <w:rPr>
+          <w:rFonts w:ascii="Times New Roman" w:eastAsia="Times New Roman" w:hAnsi="Symbol" w:cs="Times New Roman"/>
+          <w:sz w:val="24"/>
+          <w:szCs w:val="24"/>
+          <w:lang w:val="en-IN" w:eastAsia="en-IN"/>
+        </w:rPr>
+        <w:t></w:t>
+      </w:r>
+      <w:r>
+        <w:rPr>
+          <w:rFonts w:ascii="Times New Roman" w:eastAsia="Times New Roman" w:hAnsi="Times New Roman" w:cs="Times New Roman"/>
+          <w:sz w:val="24"/>
+          <w:szCs w:val="24"/>
+          <w:lang w:val="en-IN" w:eastAsia="en-IN"/>
+        </w:rPr>
+        <w:t xml:space="preserve">  National</w:t>
+      </w:r>
+      <w:proofErr w:type="gramEnd"/>
+      <w:r>
+        <w:rPr>
+          <w:rFonts w:ascii="Times New Roman" w:eastAsia="Times New Roman" w:hAnsi="Times New Roman" w:cs="Times New Roman"/>
+          <w:sz w:val="24"/>
+          <w:szCs w:val="24"/>
+          <w:lang w:val="en-IN" w:eastAsia="en-IN"/>
+        </w:rPr>
+        <w:t xml:space="preserve"> Cyber Crime Portal – </w:t>
+      </w:r>
+      <w:hyperlink r:id="rId13" w:tgtFrame="_new" w:history="1">
+        <w:r>
+          <w:rPr>
+            <w:rFonts w:ascii="Times New Roman" w:eastAsia="Times New Roman" w:hAnsi="Times New Roman" w:cs="Times New Roman"/>
+            <w:color w:val="0000FF"/>
+            <w:sz w:val="24"/>
+            <w:szCs w:val="24"/>
+            <w:u w:val="single"/>
+            <w:lang w:val="en-IN" w:eastAsia="en-IN"/>
+          </w:rPr>
+          <w:t>https://cybercrime.gov.in</w:t>
+        </w:r>
+      </w:hyperlink>
     </w:p>
     <w:p>
       <w:pPr>
@@ -2192,7 +2752,7 @@
   <w:style w:type="paragraph" w:default="1" w:styleId="Normal">
     <w:name w:val="Normal"/>
     <w:qFormat/>
-    <w:rsid w:val="00B13342"/>
+    <w:rsid w:val="007C444E"/>
   </w:style>
   <w:style w:type="paragraph" w:styleId="Heading1">
     <w:name w:val="heading 1"/>
@@ -13197,6 +13757,18 @@
       <w:sz w:val="24"/>
       <w:szCs w:val="24"/>
       <w:lang w:val="en-IN" w:eastAsia="en-IN"/>
+    </w:rPr>
+  </w:style>
+  <w:style w:type="character" w:styleId="Hyperlink">
+    <w:name w:val="Hyperlink"/>
+    <w:basedOn w:val="DefaultParagraphFont"/>
+    <w:uiPriority w:val="99"/>
+    <w:semiHidden/>
+    <w:unhideWhenUsed/>
+    <w:rsid w:val="007C444E"/>
+    <w:rPr>
+      <w:color w:val="0000FF"/>
+      <w:u w:val="single"/>
     </w:rPr>
   </w:style>
 </w:styles>

</xml_diff>